<commit_message>
updated due to findings - from codex 5.4
</commit_message>
<xml_diff>
--- a/reference_letters/ReferenceLetter_Vector.docx
+++ b/reference_letters/ReferenceLetter_Vector.docx
@@ -44,7 +44,7 @@
             </w:r>
             <w:r>
               <w:rPr>
-                <w:rFonts w:ascii="Carlito" w:hAnsi="Carlito" w:eastAsia="Carlito" w:cs="Carlito"/>
+                <w:rFonts w:ascii="Carlito" w:hAnsi="Carlito" w:cs="Carlito"/>
               </w:rPr>
             </w:r>
             <w:r>
@@ -62,123 +62,35 @@
           </w:tcPr>
           <w:p>
             <w:pPr>
-              <w:pStyle w:val="909"/>
               <w:pBdr/>
               <w:spacing/>
               <w:ind/>
               <w:jc w:val="right"/>
-              <w:rPr>
-                <w:rFonts w:ascii="Carlito" w:hAnsi="Carlito" w:cs="Carlito"/>
-                <w:sz w:val="20"/>
-                <w:szCs w:val="20"/>
-              </w:rPr>
+              <w:rPr/>
             </w:pPr>
             <w:r>
-              <w:rPr>
-                <w:rFonts w:ascii="Carlito" w:hAnsi="Carlito" w:eastAsia="Carlito" w:cs="Carlito"/>
-                <w:b/>
-                <w:sz w:val="16"/>
-                <w:szCs w:val="20"/>
-              </w:rPr>
               <w:t xml:space="preserve">Vector North America, Inc.</w:t>
+              <w:br/>
+              <w:t xml:space="preserve">39500 Orchard Hill Place Suite 500</w:t>
+              <w:br/>
+              <w:t xml:space="preserve">Novi, Michigan 48375</w:t>
+              <w:br/>
             </w:r>
-            <w:r>
-              <w:rPr>
-                <w:rFonts w:ascii="Carlito" w:hAnsi="Carlito" w:eastAsia="Carlito" w:cs="Carlito"/>
-                <w:sz w:val="20"/>
-                <w:szCs w:val="20"/>
-              </w:rPr>
-            </w:r>
-            <w:r>
-              <w:rPr>
-                <w:rFonts w:ascii="Carlito" w:hAnsi="Carlito" w:cs="Carlito"/>
-                <w:sz w:val="20"/>
-                <w:szCs w:val="20"/>
-              </w:rPr>
-            </w:r>
-          </w:p>
-          <w:p>
-            <w:pPr>
-              <w:pStyle w:val="909"/>
-              <w:pBdr/>
-              <w:spacing/>
-              <w:ind/>
-              <w:jc w:val="right"/>
-              <w:rPr>
-                <w:rFonts w:ascii="Carlito" w:hAnsi="Carlito" w:cs="Carlito"/>
-                <w:sz w:val="20"/>
-                <w:szCs w:val="20"/>
-              </w:rPr>
-            </w:pPr>
-            <w:r>
-              <w:rPr>
-                <w:rFonts w:ascii="Carlito" w:hAnsi="Carlito" w:eastAsia="Carlito" w:cs="Carlito"/>
-                <w:b w:val="0"/>
-                <w:sz w:val="16"/>
-                <w:szCs w:val="20"/>
-              </w:rPr>
-              <w:t xml:space="preserve">39500 Orchard Hill Place </w:t>
-            </w:r>
-            <w:r>
-              <w:rPr>
-                <w:rFonts w:ascii="Carlito" w:hAnsi="Carlito" w:eastAsia="Carlito" w:cs="Carlito"/>
-                <w:b w:val="0"/>
-                <w:sz w:val="16"/>
-                <w:szCs w:val="20"/>
-              </w:rPr>
-              <w:t xml:space="preserve">Suite 500</w:t>
-            </w:r>
-            <w:r>
-              <w:rPr>
-                <w:rFonts w:ascii="Carlito" w:hAnsi="Carlito" w:cs="Carlito"/>
-                <w:sz w:val="20"/>
-                <w:szCs w:val="20"/>
-              </w:rPr>
-            </w:r>
-            <w:r>
-              <w:rPr>
-                <w:rFonts w:ascii="Carlito" w:hAnsi="Carlito" w:cs="Carlito"/>
-                <w:sz w:val="20"/>
-                <w:szCs w:val="20"/>
-              </w:rPr>
-            </w:r>
-          </w:p>
-          <w:p>
-            <w:pPr>
-              <w:pStyle w:val="909"/>
-              <w:pBdr/>
-              <w:spacing/>
-              <w:ind/>
-              <w:jc w:val="right"/>
-              <w:rPr>
-                <w:rFonts w:ascii="Carlito" w:hAnsi="Carlito" w:cs="Carlito"/>
-                <w:sz w:val="20"/>
-                <w:szCs w:val="20"/>
-              </w:rPr>
-            </w:pPr>
-            <w:r>
-              <w:rPr>
-                <w:rFonts w:ascii="Carlito" w:hAnsi="Carlito" w:eastAsia="Carlito" w:cs="Carlito"/>
-                <w:b w:val="0"/>
-                <w:sz w:val="16"/>
-                <w:szCs w:val="20"/>
-              </w:rPr>
-              <w:t xml:space="preserve">Novi, Michigan 48375</w:t>
-            </w:r>
-            <w:r>
-              <w:rPr>
-                <w:rFonts w:ascii="Carlito" w:hAnsi="Carlito" w:eastAsia="Carlito" w:cs="Carlito"/>
-                <w:sz w:val="20"/>
-                <w:szCs w:val="20"/>
-              </w:rPr>
-            </w:r>
-            <w:r>
-              <w:rPr>
-                <w:rFonts w:ascii="Carlito" w:hAnsi="Carlito" w:cs="Carlito"/>
-                <w:sz w:val="20"/>
-                <w:szCs w:val="20"/>
-              </w:rPr>
-            </w:r>
+            <w:hyperlink r:id="rId11" w:tooltip="http://www.vector.com" w:history="1">
+              <w:r>
+                <w:rPr>
+                  <w:rStyle w:val="879"/>
+                </w:rPr>
+                <w:t xml:space="preserve">www.vector.com</w:t>
+              </w:r>
+              <w:r>
+                <w:rPr>
+                  <w:rStyle w:val="879"/>
+                </w:rPr>
+              </w:r>
+            </w:hyperlink>
+            <w:r/>
+            <w:r/>
           </w:p>
         </w:tc>
       </w:tr>
@@ -206,49 +118,6 @@
           <w:sz w:val="20"/>
           <w:highlight w:val="none"/>
         </w:rPr>
-      </w:r>
-      <w:r>
-        <w:rPr>
-          <w:rFonts w:ascii="Carlito" w:hAnsi="Carlito" w:eastAsia="Carlito" w:cs="Carlito"/>
-          <w:i/>
-          <w:sz w:val="20"/>
-          <w:highlight w:val="none"/>
-        </w:rPr>
-      </w:r>
-      <w:r>
-        <w:rPr>
-          <w:rFonts w:ascii="Carlito" w:hAnsi="Carlito" w:eastAsia="Carlito" w:cs="Carlito"/>
-          <w:bCs/>
-          <w:i/>
-          <w:sz w:val="20"/>
-          <w:szCs w:val="20"/>
-          <w:highlight w:val="none"/>
-        </w:rPr>
-      </w:r>
-    </w:p>
-    <w:p>
-      <w:pPr>
-        <w:pStyle w:val="909"/>
-        <w:pBdr/>
-        <w:spacing/>
-        <w:ind/>
-        <w:jc w:val="right"/>
-        <w:rPr>
-          <w:rFonts w:ascii="Carlito" w:hAnsi="Carlito" w:eastAsia="Carlito" w:cs="Carlito"/>
-          <w:bCs/>
-          <w:i/>
-          <w:sz w:val="20"/>
-          <w:szCs w:val="20"/>
-          <w:highlight w:val="none"/>
-        </w:rPr>
-      </w:pPr>
-      <w:r>
-        <w:rPr>
-          <w:rFonts w:ascii="Carlito" w:hAnsi="Carlito" w:eastAsia="Carlito" w:cs="Carlito"/>
-          <w:i/>
-          <w:sz w:val="20"/>
-        </w:rPr>
-        <w:t xml:space="preserve">Date: 16-Dec-2025</w:t>
       </w:r>
       <w:r>
         <w:rPr>
@@ -277,6 +146,51 @@
         <w:pBdr/>
         <w:spacing/>
         <w:ind/>
+        <w:jc w:val="right"/>
+        <w:rPr>
+          <w:rFonts w:ascii="Carlito" w:hAnsi="Carlito" w:eastAsia="Carlito" w:cs="Carlito"/>
+          <w:bCs/>
+          <w:i/>
+          <w:sz w:val="20"/>
+          <w:szCs w:val="20"/>
+          <w:highlight w:val="none"/>
+        </w:rPr>
+      </w:pPr>
+      <w:r>
+        <w:rPr>
+          <w:rFonts w:ascii="Carlito" w:hAnsi="Carlito" w:eastAsia="Carlito" w:cs="Carlito"/>
+          <w:i/>
+          <w:sz w:val="20"/>
+        </w:rPr>
+        <w:t xml:space="preserve">Date: 16-12-2025</w:t>
+      </w:r>
+      <w:r>
+        <w:rPr>
+          <w:rFonts w:ascii="Carlito" w:hAnsi="Carlito" w:eastAsia="Carlito" w:cs="Carlito"/>
+          <w:bCs/>
+          <w:i/>
+          <w:sz w:val="20"/>
+          <w:szCs w:val="20"/>
+          <w:highlight w:val="none"/>
+        </w:rPr>
+      </w:r>
+      <w:r>
+        <w:rPr>
+          <w:rFonts w:ascii="Carlito" w:hAnsi="Carlito" w:eastAsia="Carlito" w:cs="Carlito"/>
+          <w:bCs/>
+          <w:i/>
+          <w:sz w:val="20"/>
+          <w:szCs w:val="20"/>
+          <w:highlight w:val="none"/>
+        </w:rPr>
+      </w:r>
+    </w:p>
+    <w:p>
+      <w:pPr>
+        <w:pStyle w:val="909"/>
+        <w:pBdr/>
+        <w:spacing/>
+        <w:ind/>
         <w:rPr>
           <w:rFonts w:ascii="Carlito" w:hAnsi="Carlito" w:eastAsia="Carlito" w:cs="Carlito"/>
           <w:sz w:val="22"/>
@@ -284,13 +198,6 @@
           <w:highlight w:val="none"/>
         </w:rPr>
       </w:pPr>
-      <w:r>
-        <w:rPr>
-          <w:rFonts w:ascii="Carlito" w:hAnsi="Carlito" w:eastAsia="Carlito" w:cs="Carlito"/>
-          <w:sz w:val="22"/>
-          <w:highlight w:val="none"/>
-        </w:rPr>
-      </w:r>
       <w:r>
         <w:rPr>
           <w:rFonts w:ascii="Carlito" w:hAnsi="Carlito" w:eastAsia="Carlito" w:cs="Carlito"/>
@@ -306,6 +213,14 @@
           <w:highlight w:val="none"/>
         </w:rPr>
       </w:r>
+      <w:r>
+        <w:rPr>
+          <w:rFonts w:ascii="Carlito" w:hAnsi="Carlito" w:eastAsia="Carlito" w:cs="Carlito"/>
+          <w:sz w:val="22"/>
+          <w:szCs w:val="22"/>
+          <w:highlight w:val="none"/>
+        </w:rPr>
+      </w:r>
     </w:p>
     <w:p>
       <w:pPr>
@@ -329,7 +244,10 @@
       </w:r>
       <w:r>
         <w:rPr>
-          <w:rFonts w:ascii="Carlito" w:hAnsi="Carlito" w:cs="Carlito"/>
+          <w:rFonts w:ascii="Carlito" w:hAnsi="Carlito" w:eastAsia="Carlito" w:cs="Carlito"/>
+          <w:sz w:val="22"/>
+          <w:szCs w:val="22"/>
+          <w:highlight w:val="none"/>
         </w:rPr>
       </w:r>
       <w:r>
@@ -356,14 +274,6 @@
           <w:highlight w:val="none"/>
         </w:rPr>
       </w:pPr>
-      <w:r>
-        <w:rPr>
-          <w:rFonts w:ascii="Carlito" w:hAnsi="Carlito" w:eastAsia="Carlito" w:cs="Carlito"/>
-          <w:i/>
-          <w:sz w:val="20"/>
-          <w:highlight w:val="none"/>
-        </w:rPr>
-      </w:r>
       <w:r>
         <w:rPr>
           <w:rFonts w:ascii="Carlito" w:hAnsi="Carlito" w:eastAsia="Carlito" w:cs="Carlito"/>
@@ -382,6 +292,16 @@
           <w:highlight w:val="none"/>
         </w:rPr>
       </w:r>
+      <w:r>
+        <w:rPr>
+          <w:rFonts w:ascii="Carlito" w:hAnsi="Carlito" w:eastAsia="Carlito" w:cs="Carlito"/>
+          <w:bCs/>
+          <w:i/>
+          <w:sz w:val="20"/>
+          <w:szCs w:val="20"/>
+          <w:highlight w:val="none"/>
+        </w:rPr>
+      </w:r>
     </w:p>
     <w:p>
       <w:pPr>
@@ -389,38 +309,64 @@
         <w:pBdr/>
         <w:spacing/>
         <w:ind/>
+        <w:rPr>
+          <w:highlight w:val="none"/>
+        </w:rPr>
+      </w:pPr>
+      <w:r>
+        <w:t xml:space="preserve">This letter of reference is for </w:t>
+      </w:r>
+      <w:r>
+        <w:rPr>
+          <w:b/>
+          <w:bCs/>
+        </w:rPr>
+        <w:t xml:space="preserve">Melvin Malabanan</w:t>
+      </w:r>
+      <w:r>
+        <w:t xml:space="preserve">, who worked as a Project Engineer at Vector North America, Inc.</w:t>
+      </w:r>
+      <w:r>
         <w:rPr>
           <w:rFonts w:ascii="Carlito" w:hAnsi="Carlito" w:eastAsia="Carlito" w:cs="Carlito"/>
           <w:sz w:val="22"/>
           <w:szCs w:val="22"/>
           <w:highlight w:val="none"/>
         </w:rPr>
+      </w:r>
+      <w:r>
+        <w:rPr>
+          <w:highlight w:val="none"/>
+        </w:rPr>
+      </w:r>
+    </w:p>
+    <w:p>
+      <w:pPr>
+        <w:pStyle w:val="909"/>
+        <w:pBdr/>
+        <w:spacing/>
+        <w:ind/>
+        <w:rPr>
+          <w:rFonts w:ascii="Carlito" w:hAnsi="Carlito" w:eastAsia="Carlito" w:cs="Carlito"/>
+          <w:sz w:val="22"/>
+          <w:szCs w:val="22"/>
+          <w:highlight w:val="none"/>
+        </w:rPr>
       </w:pPr>
       <w:r>
         <w:rPr>
           <w:rFonts w:ascii="Carlito" w:hAnsi="Carlito" w:eastAsia="Carlito" w:cs="Carlito"/>
           <w:sz w:val="22"/>
+          <w:szCs w:val="22"/>
+          <w:highlight w:val="none"/>
         </w:rPr>
-        <w:t xml:space="preserve">This letter of reference is for </w:t>
-      </w:r>
-      <w:r>
-        <w:rPr>
-          <w:rFonts w:ascii="Carlito" w:hAnsi="Carlito" w:eastAsia="Carlito" w:cs="Carlito"/>
-          <w:b/>
-          <w:sz w:val="22"/>
-        </w:rPr>
-        <w:t xml:space="preserve">Melvin Malabanan</w:t>
       </w:r>
       <w:r>
         <w:rPr>
           <w:rFonts w:ascii="Carlito" w:hAnsi="Carlito" w:eastAsia="Carlito" w:cs="Carlito"/>
           <w:sz w:val="22"/>
-        </w:rPr>
-        <w:t xml:space="preserve">, who worked as an Embedded Software Engineer at Vector North America, Inc.</w:t>
-      </w:r>
-      <w:r>
-        <w:rPr>
-          <w:rFonts w:ascii="Carlito" w:hAnsi="Carlito" w:cs="Carlito"/>
+          <w:szCs w:val="22"/>
+          <w:highlight w:val="none"/>
         </w:rPr>
       </w:r>
       <w:r>
@@ -432,59 +378,28 @@
         </w:rPr>
       </w:r>
     </w:p>
-    <w:p>
-      <w:pPr>
-        <w:pStyle w:val="909"/>
-        <w:pBdr/>
-        <w:spacing/>
-        <w:ind/>
-        <w:rPr>
-          <w:rFonts w:ascii="Carlito" w:hAnsi="Carlito" w:cs="Carlito"/>
-        </w:rPr>
-      </w:pPr>
-      <w:r>
-        <w:rPr>
-          <w:rFonts w:ascii="Carlito" w:hAnsi="Carlito" w:eastAsia="Carlito" w:cs="Carlito"/>
-          <w:sz w:val="22"/>
-          <w:highlight w:val="none"/>
-        </w:rPr>
-      </w:r>
-      <w:r>
-        <w:rPr>
-          <w:rFonts w:ascii="Carlito" w:hAnsi="Carlito" w:eastAsia="Carlito" w:cs="Carlito"/>
-          <w:sz w:val="22"/>
-          <w:highlight w:val="none"/>
-        </w:rPr>
-      </w:r>
-      <w:r>
-        <w:rPr>
-          <w:rFonts w:ascii="Carlito" w:hAnsi="Carlito" w:cs="Carlito"/>
-        </w:rPr>
-      </w:r>
-    </w:p>
     <w:tbl>
       <w:tblPr>
+        <w:tblStyle w:val="957"/>
         <w:tblW w:w="0" w:type="auto"/>
-        <w:tblBorders>
-          <w:top w:val="none" w:color="000000" w:sz="4" w:space="0"/>
-          <w:left w:val="none" w:color="000000" w:sz="4" w:space="0"/>
-          <w:bottom w:val="none" w:color="000000" w:sz="4" w:space="0"/>
-          <w:right w:val="none" w:color="000000" w:sz="4" w:space="0"/>
-          <w:insideH w:val="none" w:color="000000" w:sz="4" w:space="0"/>
-          <w:insideV w:val="none" w:color="000000" w:sz="4" w:space="0"/>
-        </w:tblBorders>
+        <w:tblBorders/>
         <w:tblLook w:val="04A0" w:firstRow="1" w:lastRow="0" w:firstColumn="1" w:lastColumn="0" w:noHBand="0" w:noVBand="1"/>
       </w:tblPr>
       <w:tblGrid>
-        <w:gridCol w:w="4703"/>
-        <w:gridCol w:w="4703"/>
+        <w:gridCol w:w="4811"/>
+        <w:gridCol w:w="4811"/>
       </w:tblGrid>
       <w:tr>
         <w:trPr/>
         <w:tc>
           <w:tcPr>
-            <w:tcBorders/>
-            <w:tcW w:w="4703" w:type="dxa"/>
+            <w:tcBorders>
+              <w:top w:val="none" w:color="000000" w:sz="4" w:space="0"/>
+              <w:left w:val="none" w:color="000000" w:sz="4" w:space="0"/>
+              <w:bottom w:val="none" w:color="000000" w:sz="4" w:space="0"/>
+              <w:right w:val="none" w:color="000000" w:sz="4" w:space="0"/>
+            </w:tcBorders>
+            <w:tcW w:w="4811" w:type="dxa"/>
           </w:tcPr>
           <w:p>
             <w:pPr>
@@ -494,32 +409,47 @@
               <w:ind/>
               <w:rPr>
                 <w:rFonts w:ascii="Carlito" w:hAnsi="Carlito" w:cs="Carlito"/>
+                <w:b/>
+                <w:bCs/>
+                <w:highlight w:val="none"/>
               </w:rPr>
             </w:pPr>
             <w:r>
               <w:rPr>
                 <w:rFonts w:ascii="Carlito" w:hAnsi="Carlito" w:eastAsia="Carlito" w:cs="Carlito"/>
                 <w:b/>
-                <w:sz w:val="22"/>
+                <w:bCs/>
+                <w:highlight w:val="none"/>
               </w:rPr>
               <w:t xml:space="preserve">Employment period:</w:t>
             </w:r>
             <w:r>
               <w:rPr>
                 <w:rFonts w:ascii="Carlito" w:hAnsi="Carlito" w:eastAsia="Carlito" w:cs="Carlito"/>
+                <w:b/>
+                <w:bCs/>
+                <w:highlight w:val="none"/>
               </w:rPr>
             </w:r>
             <w:r>
               <w:rPr>
                 <w:rFonts w:ascii="Carlito" w:hAnsi="Carlito" w:cs="Carlito"/>
+                <w:b/>
+                <w:bCs/>
+                <w:highlight w:val="none"/>
               </w:rPr>
             </w:r>
           </w:p>
         </w:tc>
         <w:tc>
           <w:tcPr>
-            <w:tcBorders/>
-            <w:tcW w:w="4703" w:type="dxa"/>
+            <w:tcBorders>
+              <w:top w:val="none" w:color="000000" w:sz="4" w:space="0"/>
+              <w:left w:val="none" w:color="000000" w:sz="4" w:space="0"/>
+              <w:bottom w:val="none" w:color="000000" w:sz="4" w:space="0"/>
+              <w:right w:val="none" w:color="000000" w:sz="4" w:space="0"/>
+            </w:tcBorders>
+            <w:tcW w:w="4811" w:type="dxa"/>
           </w:tcPr>
           <w:p>
             <w:pPr>
@@ -529,23 +459,26 @@
               <w:ind/>
               <w:rPr>
                 <w:rFonts w:ascii="Carlito" w:hAnsi="Carlito" w:cs="Carlito"/>
+                <w:highlight w:val="none"/>
               </w:rPr>
             </w:pPr>
             <w:r>
               <w:rPr>
                 <w:rFonts w:ascii="Carlito" w:hAnsi="Carlito" w:eastAsia="Carlito" w:cs="Carlito"/>
-                <w:sz w:val="22"/>
+                <w:highlight w:val="none"/>
               </w:rPr>
-              <w:t xml:space="preserve">11 Jun. 2012 – 30 Nov. 2015</w:t>
+              <w:t xml:space="preserve">11/06/2012 - 30/11/2015</w:t>
             </w:r>
             <w:r>
               <w:rPr>
                 <w:rFonts w:ascii="Carlito" w:hAnsi="Carlito" w:eastAsia="Carlito" w:cs="Carlito"/>
+                <w:highlight w:val="none"/>
               </w:rPr>
             </w:r>
             <w:r>
               <w:rPr>
                 <w:rFonts w:ascii="Carlito" w:hAnsi="Carlito" w:cs="Carlito"/>
+                <w:highlight w:val="none"/>
               </w:rPr>
             </w:r>
           </w:p>
@@ -555,8 +488,13 @@
         <w:trPr/>
         <w:tc>
           <w:tcPr>
-            <w:tcBorders/>
-            <w:tcW w:w="4703" w:type="dxa"/>
+            <w:tcBorders>
+              <w:top w:val="none" w:color="000000" w:sz="4" w:space="0"/>
+              <w:left w:val="none" w:color="000000" w:sz="4" w:space="0"/>
+              <w:bottom w:val="none" w:color="000000" w:sz="4" w:space="0"/>
+              <w:right w:val="none" w:color="000000" w:sz="4" w:space="0"/>
+            </w:tcBorders>
+            <w:tcW w:w="4811" w:type="dxa"/>
           </w:tcPr>
           <w:p>
             <w:pPr>
@@ -566,32 +504,47 @@
               <w:ind/>
               <w:rPr>
                 <w:rFonts w:ascii="Carlito" w:hAnsi="Carlito" w:cs="Carlito"/>
+                <w:b/>
+                <w:bCs/>
+                <w:highlight w:val="none"/>
               </w:rPr>
             </w:pPr>
             <w:r>
               <w:rPr>
                 <w:rFonts w:ascii="Carlito" w:hAnsi="Carlito" w:eastAsia="Carlito" w:cs="Carlito"/>
                 <w:b/>
-                <w:sz w:val="22"/>
+                <w:bCs/>
+                <w:highlight w:val="none"/>
               </w:rPr>
               <w:t xml:space="preserve">Employment type:</w:t>
             </w:r>
             <w:r>
               <w:rPr>
-                <w:rFonts w:ascii="Carlito" w:hAnsi="Carlito" w:eastAsia="Carlito" w:cs="Carlito"/>
+                <w:rFonts w:ascii="Carlito" w:hAnsi="Carlito" w:cs="Carlito"/>
+                <w:b/>
+                <w:bCs/>
+                <w:highlight w:val="none"/>
               </w:rPr>
             </w:r>
             <w:r>
               <w:rPr>
                 <w:rFonts w:ascii="Carlito" w:hAnsi="Carlito" w:cs="Carlito"/>
+                <w:b/>
+                <w:bCs/>
+                <w:highlight w:val="none"/>
               </w:rPr>
             </w:r>
           </w:p>
         </w:tc>
         <w:tc>
           <w:tcPr>
-            <w:tcBorders/>
-            <w:tcW w:w="4703" w:type="dxa"/>
+            <w:tcBorders>
+              <w:top w:val="none" w:color="000000" w:sz="4" w:space="0"/>
+              <w:left w:val="none" w:color="000000" w:sz="4" w:space="0"/>
+              <w:bottom w:val="none" w:color="000000" w:sz="4" w:space="0"/>
+              <w:right w:val="none" w:color="000000" w:sz="4" w:space="0"/>
+            </w:tcBorders>
+            <w:tcW w:w="4811" w:type="dxa"/>
           </w:tcPr>
           <w:p>
             <w:pPr>
@@ -601,23 +554,26 @@
               <w:ind/>
               <w:rPr>
                 <w:rFonts w:ascii="Carlito" w:hAnsi="Carlito" w:cs="Carlito"/>
+                <w:highlight w:val="none"/>
               </w:rPr>
             </w:pPr>
             <w:r>
               <w:rPr>
                 <w:rFonts w:ascii="Carlito" w:hAnsi="Carlito" w:eastAsia="Carlito" w:cs="Carlito"/>
-                <w:sz w:val="22"/>
+                <w:highlight w:val="none"/>
               </w:rPr>
               <w:t xml:space="preserve">Full-time permanent</w:t>
             </w:r>
             <w:r>
               <w:rPr>
                 <w:rFonts w:ascii="Carlito" w:hAnsi="Carlito" w:eastAsia="Carlito" w:cs="Carlito"/>
+                <w:highlight w:val="none"/>
               </w:rPr>
             </w:r>
             <w:r>
               <w:rPr>
                 <w:rFonts w:ascii="Carlito" w:hAnsi="Carlito" w:cs="Carlito"/>
+                <w:highlight w:val="none"/>
               </w:rPr>
             </w:r>
           </w:p>
@@ -627,8 +583,13 @@
         <w:trPr/>
         <w:tc>
           <w:tcPr>
-            <w:tcBorders/>
-            <w:tcW w:w="4703" w:type="dxa"/>
+            <w:tcBorders>
+              <w:top w:val="none" w:color="000000" w:sz="4" w:space="0"/>
+              <w:left w:val="none" w:color="000000" w:sz="4" w:space="0"/>
+              <w:bottom w:val="none" w:color="000000" w:sz="4" w:space="0"/>
+              <w:right w:val="none" w:color="000000" w:sz="4" w:space="0"/>
+            </w:tcBorders>
+            <w:tcW w:w="4811" w:type="dxa"/>
           </w:tcPr>
           <w:p>
             <w:pPr>
@@ -638,32 +599,47 @@
               <w:ind/>
               <w:rPr>
                 <w:rFonts w:ascii="Carlito" w:hAnsi="Carlito" w:cs="Carlito"/>
+                <w:b/>
+                <w:bCs/>
+                <w:highlight w:val="none"/>
               </w:rPr>
             </w:pPr>
             <w:r>
               <w:rPr>
                 <w:rFonts w:ascii="Carlito" w:hAnsi="Carlito" w:eastAsia="Carlito" w:cs="Carlito"/>
                 <w:b/>
-                <w:sz w:val="22"/>
+                <w:bCs/>
+                <w:highlight w:val="none"/>
               </w:rPr>
               <w:t xml:space="preserve">Hours per week:</w:t>
             </w:r>
             <w:r>
               <w:rPr>
-                <w:rFonts w:ascii="Carlito" w:hAnsi="Carlito" w:eastAsia="Carlito" w:cs="Carlito"/>
+                <w:rFonts w:ascii="Carlito" w:hAnsi="Carlito" w:cs="Carlito"/>
+                <w:b/>
+                <w:bCs/>
+                <w:highlight w:val="none"/>
               </w:rPr>
             </w:r>
             <w:r>
               <w:rPr>
                 <w:rFonts w:ascii="Carlito" w:hAnsi="Carlito" w:cs="Carlito"/>
+                <w:b/>
+                <w:bCs/>
+                <w:highlight w:val="none"/>
               </w:rPr>
             </w:r>
           </w:p>
         </w:tc>
         <w:tc>
           <w:tcPr>
-            <w:tcBorders/>
-            <w:tcW w:w="4703" w:type="dxa"/>
+            <w:tcBorders>
+              <w:top w:val="none" w:color="000000" w:sz="4" w:space="0"/>
+              <w:left w:val="none" w:color="000000" w:sz="4" w:space="0"/>
+              <w:bottom w:val="none" w:color="000000" w:sz="4" w:space="0"/>
+              <w:right w:val="none" w:color="000000" w:sz="4" w:space="0"/>
+            </w:tcBorders>
+            <w:tcW w:w="4811" w:type="dxa"/>
           </w:tcPr>
           <w:p>
             <w:pPr>
@@ -673,23 +649,26 @@
               <w:ind/>
               <w:rPr>
                 <w:rFonts w:ascii="Carlito" w:hAnsi="Carlito" w:cs="Carlito"/>
+                <w:highlight w:val="none"/>
               </w:rPr>
             </w:pPr>
             <w:r>
               <w:rPr>
                 <w:rFonts w:ascii="Carlito" w:hAnsi="Carlito" w:eastAsia="Carlito" w:cs="Carlito"/>
-                <w:sz w:val="22"/>
+                <w:highlight w:val="none"/>
               </w:rPr>
               <w:t xml:space="preserve">40 hours minimum</w:t>
             </w:r>
             <w:r>
               <w:rPr>
                 <w:rFonts w:ascii="Carlito" w:hAnsi="Carlito" w:eastAsia="Carlito" w:cs="Carlito"/>
+                <w:highlight w:val="none"/>
               </w:rPr>
             </w:r>
             <w:r>
               <w:rPr>
                 <w:rFonts w:ascii="Carlito" w:hAnsi="Carlito" w:cs="Carlito"/>
+                <w:highlight w:val="none"/>
               </w:rPr>
             </w:r>
           </w:p>
@@ -699,8 +678,13 @@
         <w:trPr/>
         <w:tc>
           <w:tcPr>
-            <w:tcBorders/>
-            <w:tcW w:w="4703" w:type="dxa"/>
+            <w:tcBorders>
+              <w:top w:val="none" w:color="000000" w:sz="4" w:space="0"/>
+              <w:left w:val="none" w:color="000000" w:sz="4" w:space="0"/>
+              <w:bottom w:val="none" w:color="000000" w:sz="4" w:space="0"/>
+              <w:right w:val="none" w:color="000000" w:sz="4" w:space="0"/>
+            </w:tcBorders>
+            <w:tcW w:w="4811" w:type="dxa"/>
           </w:tcPr>
           <w:p>
             <w:pPr>
@@ -710,32 +694,47 @@
               <w:ind/>
               <w:rPr>
                 <w:rFonts w:ascii="Carlito" w:hAnsi="Carlito" w:cs="Carlito"/>
+                <w:b/>
+                <w:bCs/>
+                <w:highlight w:val="none"/>
               </w:rPr>
             </w:pPr>
             <w:r>
               <w:rPr>
                 <w:rFonts w:ascii="Carlito" w:hAnsi="Carlito" w:eastAsia="Carlito" w:cs="Carlito"/>
                 <w:b/>
-                <w:sz w:val="22"/>
+                <w:bCs/>
+                <w:highlight w:val="none"/>
               </w:rPr>
               <w:t xml:space="preserve">Annual salary (before tax):</w:t>
             </w:r>
             <w:r>
               <w:rPr>
-                <w:rFonts w:ascii="Carlito" w:hAnsi="Carlito" w:eastAsia="Carlito" w:cs="Carlito"/>
+                <w:rFonts w:ascii="Carlito" w:hAnsi="Carlito" w:cs="Carlito"/>
+                <w:b/>
+                <w:bCs/>
+                <w:highlight w:val="none"/>
               </w:rPr>
             </w:r>
             <w:r>
               <w:rPr>
                 <w:rFonts w:ascii="Carlito" w:hAnsi="Carlito" w:cs="Carlito"/>
+                <w:b/>
+                <w:bCs/>
+                <w:highlight w:val="none"/>
               </w:rPr>
             </w:r>
           </w:p>
         </w:tc>
         <w:tc>
           <w:tcPr>
-            <w:tcBorders/>
-            <w:tcW w:w="4703" w:type="dxa"/>
+            <w:tcBorders>
+              <w:top w:val="none" w:color="000000" w:sz="4" w:space="0"/>
+              <w:left w:val="none" w:color="000000" w:sz="4" w:space="0"/>
+              <w:bottom w:val="none" w:color="000000" w:sz="4" w:space="0"/>
+              <w:right w:val="none" w:color="000000" w:sz="4" w:space="0"/>
+            </w:tcBorders>
+            <w:tcW w:w="4811" w:type="dxa"/>
           </w:tcPr>
           <w:p>
             <w:pPr>
@@ -745,23 +744,26 @@
               <w:ind/>
               <w:rPr>
                 <w:rFonts w:ascii="Carlito" w:hAnsi="Carlito" w:cs="Carlito"/>
+                <w:highlight w:val="none"/>
               </w:rPr>
             </w:pPr>
             <w:r>
               <w:rPr>
                 <w:rFonts w:ascii="Carlito" w:hAnsi="Carlito" w:eastAsia="Carlito" w:cs="Carlito"/>
-                <w:sz w:val="22"/>
+                <w:highlight w:val="none"/>
               </w:rPr>
-              <w:t xml:space="preserve">$65,000.00 USD per annum</w:t>
+              <w:t xml:space="preserve">$65,000 USD per annum</w:t>
             </w:r>
             <w:r>
               <w:rPr>
                 <w:rFonts w:ascii="Carlito" w:hAnsi="Carlito" w:eastAsia="Carlito" w:cs="Carlito"/>
+                <w:highlight w:val="none"/>
               </w:rPr>
             </w:r>
             <w:r>
               <w:rPr>
                 <w:rFonts w:ascii="Carlito" w:hAnsi="Carlito" w:cs="Carlito"/>
+                <w:highlight w:val="none"/>
               </w:rPr>
             </w:r>
           </w:p>
@@ -771,8 +773,13 @@
         <w:trPr/>
         <w:tc>
           <w:tcPr>
-            <w:tcBorders/>
-            <w:tcW w:w="4703" w:type="dxa"/>
+            <w:tcBorders>
+              <w:top w:val="none" w:color="000000" w:sz="4" w:space="0"/>
+              <w:left w:val="none" w:color="000000" w:sz="4" w:space="0"/>
+              <w:bottom w:val="none" w:color="000000" w:sz="4" w:space="0"/>
+              <w:right w:val="none" w:color="000000" w:sz="4" w:space="0"/>
+            </w:tcBorders>
+            <w:tcW w:w="4811" w:type="dxa"/>
           </w:tcPr>
           <w:p>
             <w:pPr>
@@ -782,32 +789,47 @@
               <w:ind/>
               <w:rPr>
                 <w:rFonts w:ascii="Carlito" w:hAnsi="Carlito" w:cs="Carlito"/>
+                <w:b/>
+                <w:bCs/>
+                <w:highlight w:val="none"/>
               </w:rPr>
             </w:pPr>
             <w:r>
               <w:rPr>
                 <w:rFonts w:ascii="Carlito" w:hAnsi="Carlito" w:eastAsia="Carlito" w:cs="Carlito"/>
                 <w:b/>
-                <w:sz w:val="22"/>
+                <w:bCs/>
+                <w:highlight w:val="none"/>
               </w:rPr>
               <w:t xml:space="preserve">Location of work:</w:t>
             </w:r>
             <w:r>
               <w:rPr>
-                <w:rFonts w:ascii="Carlito" w:hAnsi="Carlito" w:eastAsia="Carlito" w:cs="Carlito"/>
+                <w:rFonts w:ascii="Carlito" w:hAnsi="Carlito" w:cs="Carlito"/>
+                <w:b/>
+                <w:bCs/>
+                <w:highlight w:val="none"/>
               </w:rPr>
             </w:r>
             <w:r>
               <w:rPr>
                 <w:rFonts w:ascii="Carlito" w:hAnsi="Carlito" w:cs="Carlito"/>
+                <w:b/>
+                <w:bCs/>
+                <w:highlight w:val="none"/>
               </w:rPr>
             </w:r>
           </w:p>
         </w:tc>
         <w:tc>
           <w:tcPr>
-            <w:tcBorders/>
-            <w:tcW w:w="4703" w:type="dxa"/>
+            <w:tcBorders>
+              <w:top w:val="none" w:color="000000" w:sz="4" w:space="0"/>
+              <w:left w:val="none" w:color="000000" w:sz="4" w:space="0"/>
+              <w:bottom w:val="none" w:color="000000" w:sz="4" w:space="0"/>
+              <w:right w:val="none" w:color="000000" w:sz="4" w:space="0"/>
+            </w:tcBorders>
+            <w:tcW w:w="4811" w:type="dxa"/>
           </w:tcPr>
           <w:p>
             <w:pPr>
@@ -817,23 +839,26 @@
               <w:ind/>
               <w:rPr>
                 <w:rFonts w:ascii="Carlito" w:hAnsi="Carlito" w:cs="Carlito"/>
+                <w:highlight w:val="none"/>
               </w:rPr>
             </w:pPr>
             <w:r>
               <w:rPr>
                 <w:rFonts w:ascii="Carlito" w:hAnsi="Carlito" w:eastAsia="Carlito" w:cs="Carlito"/>
-                <w:sz w:val="22"/>
+                <w:highlight w:val="none"/>
               </w:rPr>
-              <w:t xml:space="preserve">Novi, Michigan, USA</w:t>
+              <w:t xml:space="preserve">Outside Australia – Novi, Michigan, USA</w:t>
             </w:r>
             <w:r>
               <w:rPr>
                 <w:rFonts w:ascii="Carlito" w:hAnsi="Carlito" w:eastAsia="Carlito" w:cs="Carlito"/>
+                <w:highlight w:val="none"/>
               </w:rPr>
             </w:r>
             <w:r>
               <w:rPr>
                 <w:rFonts w:ascii="Carlito" w:hAnsi="Carlito" w:cs="Carlito"/>
+                <w:highlight w:val="none"/>
               </w:rPr>
             </w:r>
           </w:p>
@@ -843,8 +868,13 @@
         <w:trPr/>
         <w:tc>
           <w:tcPr>
-            <w:tcBorders/>
-            <w:tcW w:w="4703" w:type="dxa"/>
+            <w:tcBorders>
+              <w:top w:val="none" w:color="000000" w:sz="4" w:space="0"/>
+              <w:left w:val="none" w:color="000000" w:sz="4" w:space="0"/>
+              <w:bottom w:val="none" w:color="000000" w:sz="4" w:space="0"/>
+              <w:right w:val="none" w:color="000000" w:sz="4" w:space="0"/>
+            </w:tcBorders>
+            <w:tcW w:w="4811" w:type="dxa"/>
           </w:tcPr>
           <w:p>
             <w:pPr>
@@ -854,32 +884,47 @@
               <w:ind/>
               <w:rPr>
                 <w:rFonts w:ascii="Carlito" w:hAnsi="Carlito" w:cs="Carlito"/>
+                <w:b/>
+                <w:bCs/>
+                <w:highlight w:val="none"/>
               </w:rPr>
             </w:pPr>
             <w:r>
               <w:rPr>
                 <w:rFonts w:ascii="Carlito" w:hAnsi="Carlito" w:eastAsia="Carlito" w:cs="Carlito"/>
                 <w:b/>
-                <w:sz w:val="22"/>
+                <w:bCs/>
+                <w:highlight w:val="none"/>
               </w:rPr>
               <w:t xml:space="preserve">Position/role title:</w:t>
             </w:r>
             <w:r>
               <w:rPr>
-                <w:rFonts w:ascii="Carlito" w:hAnsi="Carlito" w:eastAsia="Carlito" w:cs="Carlito"/>
+                <w:rFonts w:ascii="Carlito" w:hAnsi="Carlito" w:cs="Carlito"/>
+                <w:b/>
+                <w:bCs/>
+                <w:highlight w:val="none"/>
               </w:rPr>
             </w:r>
             <w:r>
               <w:rPr>
                 <w:rFonts w:ascii="Carlito" w:hAnsi="Carlito" w:cs="Carlito"/>
+                <w:b/>
+                <w:bCs/>
+                <w:highlight w:val="none"/>
               </w:rPr>
             </w:r>
           </w:p>
         </w:tc>
         <w:tc>
           <w:tcPr>
-            <w:tcBorders/>
-            <w:tcW w:w="4703" w:type="dxa"/>
+            <w:tcBorders>
+              <w:top w:val="none" w:color="000000" w:sz="4" w:space="0"/>
+              <w:left w:val="none" w:color="000000" w:sz="4" w:space="0"/>
+              <w:bottom w:val="none" w:color="000000" w:sz="4" w:space="0"/>
+              <w:right w:val="none" w:color="000000" w:sz="4" w:space="0"/>
+            </w:tcBorders>
+            <w:tcW w:w="4811" w:type="dxa"/>
           </w:tcPr>
           <w:p>
             <w:pPr>
@@ -889,23 +934,26 @@
               <w:ind/>
               <w:rPr>
                 <w:rFonts w:ascii="Carlito" w:hAnsi="Carlito" w:cs="Carlito"/>
+                <w:highlight w:val="none"/>
               </w:rPr>
             </w:pPr>
             <w:r>
               <w:rPr>
                 <w:rFonts w:ascii="Carlito" w:hAnsi="Carlito" w:eastAsia="Carlito" w:cs="Carlito"/>
-                <w:sz w:val="22"/>
+                <w:highlight w:val="none"/>
               </w:rPr>
-              <w:t xml:space="preserve">Embedded Software Engineer</w:t>
+              <w:t xml:space="preserve">Project Engineer (Embedded Software)</w:t>
             </w:r>
             <w:r>
               <w:rPr>
                 <w:rFonts w:ascii="Carlito" w:hAnsi="Carlito" w:eastAsia="Carlito" w:cs="Carlito"/>
+                <w:highlight w:val="none"/>
               </w:rPr>
             </w:r>
             <w:r>
               <w:rPr>
                 <w:rFonts w:ascii="Carlito" w:hAnsi="Carlito" w:cs="Carlito"/>
+                <w:highlight w:val="none"/>
               </w:rPr>
             </w:r>
           </w:p>
@@ -932,10 +980,7 @@
       </w:r>
       <w:r>
         <w:rPr>
-          <w:rFonts w:ascii="Carlito" w:hAnsi="Carlito" w:eastAsia="Carlito" w:cs="Carlito"/>
-          <w:b/>
-          <w:sz w:val="22"/>
-          <w:highlight w:val="none"/>
+          <w:rFonts w:ascii="Carlito" w:hAnsi="Carlito" w:cs="Carlito"/>
         </w:rPr>
       </w:r>
       <w:r>
@@ -1015,7 +1060,9 @@
         <w:rPr>
           <w:rFonts w:ascii="Carlito" w:hAnsi="Carlito" w:eastAsia="Carlito" w:cs="Carlito"/>
           <w:b/>
+          <w:bCs/>
           <w:sz w:val="22"/>
+          <w:szCs w:val="22"/>
           <w:highlight w:val="none"/>
         </w:rPr>
       </w:r>
@@ -1045,395 +1092,7 @@
         </w:rPr>
       </w:pPr>
       <w:r>
-        <w:rPr>
-          <w:rFonts w:ascii="Carlito" w:hAnsi="Carlito" w:eastAsia="Carlito" w:cs="Carlito"/>
-          <w:sz w:val="22"/>
-        </w:rPr>
-        <w:t xml:space="preserve">Modification, testing, and implementation of embedded software used in automotive electronic control modules</w:t>
-      </w:r>
-      <w:r>
-        <w:rPr>
-          <w:rFonts w:ascii="Carlito" w:hAnsi="Carlito" w:eastAsia="Carlito" w:cs="Carlito"/>
-        </w:rPr>
-      </w:r>
-      <w:r>
-        <w:rPr>
-          <w:rFonts w:ascii="Carlito" w:hAnsi="Carlito" w:cs="Carlito"/>
-        </w:rPr>
-      </w:r>
-    </w:p>
-    <w:p>
-      <w:pPr>
-        <w:pStyle w:val="909"/>
-        <w:numPr>
-          <w:ilvl w:val="0"/>
-          <w:numId w:val="10"/>
-        </w:numPr>
-        <w:pBdr/>
-        <w:spacing/>
-        <w:ind/>
-        <w:rPr>
-          <w:rFonts w:ascii="Carlito" w:hAnsi="Carlito" w:cs="Carlito"/>
-        </w:rPr>
-      </w:pPr>
-      <w:r>
-        <w:rPr>
-          <w:rFonts w:ascii="Carlito" w:hAnsi="Carlito" w:eastAsia="Carlito" w:cs="Carlito"/>
-          <w:sz w:val="22"/>
-        </w:rPr>
-        <w:t xml:space="preserve">Design and development of customer-specific embedded software components</w:t>
-      </w:r>
-      <w:r>
-        <w:rPr>
-          <w:rFonts w:ascii="Carlito" w:hAnsi="Carlito" w:eastAsia="Carlito" w:cs="Carlito"/>
-        </w:rPr>
-      </w:r>
-      <w:r>
-        <w:rPr>
-          <w:rFonts w:ascii="Carlito" w:hAnsi="Carlito" w:cs="Carlito"/>
-        </w:rPr>
-      </w:r>
-    </w:p>
-    <w:p>
-      <w:pPr>
-        <w:pStyle w:val="909"/>
-        <w:numPr>
-          <w:ilvl w:val="0"/>
-          <w:numId w:val="10"/>
-        </w:numPr>
-        <w:pBdr/>
-        <w:spacing/>
-        <w:ind/>
-        <w:rPr>
-          <w:rFonts w:ascii="Carlito" w:hAnsi="Carlito" w:cs="Carlito"/>
-        </w:rPr>
-      </w:pPr>
-      <w:r>
-        <w:rPr>
-          <w:rFonts w:ascii="Carlito" w:hAnsi="Carlito" w:eastAsia="Carlito" w:cs="Carlito"/>
-          <w:sz w:val="22"/>
-        </w:rPr>
-        <w:t xml:space="preserve">Determination of customer requirements and follow-up on engineering specifications</w:t>
-      </w:r>
-      <w:r>
-        <w:rPr>
-          <w:rFonts w:ascii="Carlito" w:hAnsi="Carlito" w:eastAsia="Carlito" w:cs="Carlito"/>
-        </w:rPr>
-      </w:r>
-      <w:r>
-        <w:rPr>
-          <w:rFonts w:ascii="Carlito" w:hAnsi="Carlito" w:cs="Carlito"/>
-        </w:rPr>
-      </w:r>
-    </w:p>
-    <w:p>
-      <w:pPr>
-        <w:pStyle w:val="909"/>
-        <w:numPr>
-          <w:ilvl w:val="0"/>
-          <w:numId w:val="10"/>
-        </w:numPr>
-        <w:pBdr/>
-        <w:spacing/>
-        <w:ind/>
-        <w:rPr>
-          <w:rFonts w:ascii="Carlito" w:hAnsi="Carlito" w:cs="Carlito"/>
-        </w:rPr>
-      </w:pPr>
-      <w:r>
-        <w:rPr>
-          <w:rFonts w:ascii="Carlito" w:hAnsi="Carlito" w:eastAsia="Carlito" w:cs="Carlito"/>
-          <w:sz w:val="22"/>
-        </w:rPr>
-        <w:t xml:space="preserve">Handling of embedded software system integration and overall project management</w:t>
-      </w:r>
-      <w:r>
-        <w:rPr>
-          <w:rFonts w:ascii="Carlito" w:hAnsi="Carlito" w:eastAsia="Carlito" w:cs="Carlito"/>
-        </w:rPr>
-      </w:r>
-      <w:r>
-        <w:rPr>
-          <w:rFonts w:ascii="Carlito" w:hAnsi="Carlito" w:cs="Carlito"/>
-        </w:rPr>
-      </w:r>
-    </w:p>
-    <w:p>
-      <w:pPr>
-        <w:pStyle w:val="909"/>
-        <w:numPr>
-          <w:ilvl w:val="0"/>
-          <w:numId w:val="10"/>
-        </w:numPr>
-        <w:pBdr/>
-        <w:spacing/>
-        <w:ind/>
-        <w:rPr>
-          <w:rFonts w:ascii="Carlito" w:hAnsi="Carlito" w:cs="Carlito"/>
-        </w:rPr>
-      </w:pPr>
-      <w:r>
-        <w:rPr>
-          <w:rFonts w:ascii="Carlito" w:hAnsi="Carlito" w:eastAsia="Carlito" w:cs="Carlito"/>
-          <w:sz w:val="22"/>
-        </w:rPr>
-        <w:t xml:space="preserve">Troubleshooting of software and customer implementation issues</w:t>
-      </w:r>
-      <w:r>
-        <w:rPr>
-          <w:rFonts w:ascii="Carlito" w:hAnsi="Carlito" w:eastAsia="Carlito" w:cs="Carlito"/>
-        </w:rPr>
-      </w:r>
-      <w:r>
-        <w:rPr>
-          <w:rFonts w:ascii="Carlito" w:hAnsi="Carlito" w:cs="Carlito"/>
-        </w:rPr>
-      </w:r>
-    </w:p>
-    <w:p>
-      <w:pPr>
-        <w:pStyle w:val="909"/>
-        <w:numPr>
-          <w:ilvl w:val="0"/>
-          <w:numId w:val="10"/>
-        </w:numPr>
-        <w:pBdr/>
-        <w:spacing/>
-        <w:ind/>
-        <w:rPr>
-          <w:rFonts w:ascii="Carlito" w:hAnsi="Carlito" w:cs="Carlito"/>
-        </w:rPr>
-      </w:pPr>
-      <w:r>
-        <w:rPr>
-          <w:rFonts w:ascii="Carlito" w:hAnsi="Carlito" w:eastAsia="Carlito" w:cs="Carlito"/>
-          <w:sz w:val="22"/>
-        </w:rPr>
-        <w:t xml:space="preserve">Provision of technical support for embedded software used by product developers and test engineers at OEMs and suppliers</w:t>
-      </w:r>
-      <w:r>
-        <w:rPr>
-          <w:rFonts w:ascii="Carlito" w:hAnsi="Carlito" w:eastAsia="Carlito" w:cs="Carlito"/>
-        </w:rPr>
-      </w:r>
-      <w:r>
-        <w:rPr>
-          <w:rFonts w:ascii="Carlito" w:hAnsi="Carlito" w:cs="Carlito"/>
-        </w:rPr>
-      </w:r>
-    </w:p>
-    <w:p>
-      <w:pPr>
-        <w:pStyle w:val="909"/>
-        <w:numPr>
-          <w:ilvl w:val="0"/>
-          <w:numId w:val="10"/>
-        </w:numPr>
-        <w:pBdr/>
-        <w:spacing/>
-        <w:ind/>
-        <w:rPr>
-          <w:rFonts w:ascii="Carlito" w:hAnsi="Carlito" w:cs="Carlito"/>
-        </w:rPr>
-      </w:pPr>
-      <w:r>
-        <w:rPr>
-          <w:rFonts w:ascii="Carlito" w:hAnsi="Carlito" w:eastAsia="Carlito" w:cs="Carlito"/>
-          <w:sz w:val="22"/>
-        </w:rPr>
-        <w:t xml:space="preserve">Development of positive, long-term customer relationships through professional communication and engagement</w:t>
-      </w:r>
-      <w:r>
-        <w:rPr>
-          <w:rFonts w:ascii="Carlito" w:hAnsi="Carlito" w:eastAsia="Carlito" w:cs="Carlito"/>
-        </w:rPr>
-      </w:r>
-      <w:r>
-        <w:rPr>
-          <w:rFonts w:ascii="Carlito" w:hAnsi="Carlito" w:cs="Carlito"/>
-        </w:rPr>
-      </w:r>
-    </w:p>
-    <w:p>
-      <w:pPr>
-        <w:pStyle w:val="909"/>
-        <w:numPr>
-          <w:ilvl w:val="0"/>
-          <w:numId w:val="10"/>
-        </w:numPr>
-        <w:pBdr/>
-        <w:spacing/>
-        <w:ind/>
-        <w:rPr>
-          <w:rFonts w:ascii="Carlito" w:hAnsi="Carlito" w:cs="Carlito"/>
-        </w:rPr>
-      </w:pPr>
-      <w:r>
-        <w:rPr>
-          <w:rFonts w:ascii="Carlito" w:hAnsi="Carlito" w:eastAsia="Carlito" w:cs="Carlito"/>
-          <w:sz w:val="22"/>
-        </w:rPr>
-        <w:t xml:space="preserve">Delivery of customer training, courseware development, and instruction in classroom and workshop settings</w:t>
-      </w:r>
-      <w:r>
-        <w:rPr>
-          <w:rFonts w:ascii="Carlito" w:hAnsi="Carlito" w:eastAsia="Carlito" w:cs="Carlito"/>
-        </w:rPr>
-      </w:r>
-      <w:r>
-        <w:rPr>
-          <w:rFonts w:ascii="Carlito" w:hAnsi="Carlito" w:cs="Carlito"/>
-        </w:rPr>
-      </w:r>
-    </w:p>
-    <w:p>
-      <w:pPr>
-        <w:pStyle w:val="909"/>
-        <w:numPr>
-          <w:ilvl w:val="0"/>
-          <w:numId w:val="10"/>
-        </w:numPr>
-        <w:pBdr/>
-        <w:spacing/>
-        <w:ind/>
-        <w:rPr>
-          <w:rFonts w:ascii="Carlito" w:hAnsi="Carlito" w:cs="Carlito"/>
-        </w:rPr>
-      </w:pPr>
-      <w:r>
-        <w:rPr>
-          <w:rFonts w:ascii="Carlito" w:hAnsi="Carlito" w:eastAsia="Carlito" w:cs="Carlito"/>
-          <w:sz w:val="22"/>
-        </w:rPr>
-        <w:t xml:space="preserve">Embedded software development with fluency in C/C++</w:t>
-      </w:r>
-      <w:r>
-        <w:rPr>
-          <w:rFonts w:ascii="Carlito" w:hAnsi="Carlito" w:eastAsia="Carlito" w:cs="Carlito"/>
-        </w:rPr>
-      </w:r>
-      <w:r>
-        <w:rPr>
-          <w:rFonts w:ascii="Carlito" w:hAnsi="Carlito" w:cs="Carlito"/>
-        </w:rPr>
-      </w:r>
-    </w:p>
-    <w:p>
-      <w:pPr>
-        <w:pStyle w:val="909"/>
-        <w:numPr>
-          <w:ilvl w:val="0"/>
-          <w:numId w:val="10"/>
-        </w:numPr>
-        <w:pBdr/>
-        <w:spacing/>
-        <w:ind/>
-        <w:rPr>
-          <w:rFonts w:ascii="Carlito" w:hAnsi="Carlito" w:cs="Carlito"/>
-        </w:rPr>
-      </w:pPr>
-      <w:r>
-        <w:rPr>
-          <w:rFonts w:ascii="Carlito" w:hAnsi="Carlito" w:eastAsia="Carlito" w:cs="Carlito"/>
-          <w:sz w:val="22"/>
-        </w:rPr>
-        <w:t xml:space="preserve">Application of various automotive communication protocols (CAN, LIN) and knowledge of distributed embedded system architectures</w:t>
-      </w:r>
-      <w:r>
-        <w:rPr>
-          <w:rFonts w:ascii="Carlito" w:hAnsi="Carlito" w:eastAsia="Carlito" w:cs="Carlito"/>
-        </w:rPr>
-      </w:r>
-      <w:r>
-        <w:rPr>
-          <w:rFonts w:ascii="Carlito" w:hAnsi="Carlito" w:cs="Carlito"/>
-        </w:rPr>
-      </w:r>
-    </w:p>
-    <w:p>
-      <w:pPr>
-        <w:pStyle w:val="909"/>
-        <w:numPr>
-          <w:ilvl w:val="0"/>
-          <w:numId w:val="10"/>
-        </w:numPr>
-        <w:pBdr/>
-        <w:spacing/>
-        <w:ind/>
-        <w:rPr>
-          <w:rFonts w:ascii="Carlito" w:hAnsi="Carlito" w:cs="Carlito"/>
-        </w:rPr>
-      </w:pPr>
-      <w:r>
-        <w:rPr>
-          <w:rFonts w:ascii="Carlito" w:hAnsi="Carlito" w:eastAsia="Carlito" w:cs="Carlito"/>
-          <w:sz w:val="22"/>
-        </w:rPr>
-        <w:t xml:space="preserve">Understanding of ECU development life cycle and in-vehicle networking systems</w:t>
-      </w:r>
-      <w:r>
-        <w:rPr>
-          <w:rFonts w:ascii="Carlito" w:hAnsi="Carlito" w:eastAsia="Carlito" w:cs="Carlito"/>
-        </w:rPr>
-      </w:r>
-      <w:r>
-        <w:rPr>
-          <w:rFonts w:ascii="Carlito" w:hAnsi="Carlito" w:cs="Carlito"/>
-        </w:rPr>
-      </w:r>
-    </w:p>
-    <w:p>
-      <w:pPr>
-        <w:pStyle w:val="909"/>
-        <w:numPr>
-          <w:ilvl w:val="0"/>
-          <w:numId w:val="10"/>
-        </w:numPr>
-        <w:pBdr/>
-        <w:spacing/>
-        <w:ind/>
-        <w:rPr>
-          <w:rFonts w:ascii="Carlito" w:hAnsi="Carlito" w:cs="Carlito"/>
-        </w:rPr>
-      </w:pPr>
-      <w:r>
-        <w:rPr>
-          <w:rFonts w:ascii="Carlito" w:hAnsi="Carlito" w:eastAsia="Carlito" w:cs="Carlito"/>
-          <w:sz w:val="22"/>
-        </w:rPr>
-        <w:t xml:space="preserve">Root-cause analysis and problem-solving for complex technical issues</w:t>
-      </w:r>
-      <w:r>
-        <w:rPr>
-          <w:rFonts w:ascii="Carlito" w:hAnsi="Carlito" w:eastAsia="Carlito" w:cs="Carlito"/>
-        </w:rPr>
-      </w:r>
-      <w:r>
-        <w:rPr>
-          <w:rFonts w:ascii="Carlito" w:hAnsi="Carlito" w:cs="Carlito"/>
-        </w:rPr>
-      </w:r>
-    </w:p>
-    <w:p>
-      <w:pPr>
-        <w:pStyle w:val="909"/>
-        <w:numPr>
-          <w:ilvl w:val="0"/>
-          <w:numId w:val="10"/>
-        </w:numPr>
-        <w:pBdr/>
-        <w:spacing/>
-        <w:ind/>
-        <w:rPr>
-          <w:rFonts w:ascii="Carlito" w:hAnsi="Carlito" w:cs="Carlito"/>
-        </w:rPr>
-      </w:pPr>
-      <w:r>
-        <w:rPr>
-          <w:rFonts w:ascii="Carlito" w:hAnsi="Carlito" w:eastAsia="Carlito" w:cs="Carlito"/>
-          <w:sz w:val="22"/>
-        </w:rPr>
-        <w:t xml:space="preserve">Monitoring and implementation of software upgrades and new feature requirements</w:t>
+        <w:t xml:space="preserve">Customer requirement analysis and CAN stack integration for embedded automotive software projects</w:t>
       </w:r>
       <w:r>
         <w:rPr>
@@ -1449,6 +1108,174 @@
     <w:p>
       <w:pPr>
         <w:pStyle w:val="909"/>
+        <w:numPr>
+          <w:ilvl w:val="0"/>
+          <w:numId w:val="10"/>
+        </w:numPr>
+        <w:pBdr/>
+        <w:spacing/>
+        <w:ind/>
+        <w:rPr>
+          <w:rFonts w:ascii="Carlito" w:hAnsi="Carlito" w:cs="Carlito"/>
+        </w:rPr>
+      </w:pPr>
+      <w:r>
+        <w:t xml:space="preserve">Overall project management and coordination of technical resources, schedules, and deliverables</w:t>
+      </w:r>
+      <w:r>
+        <w:rPr>
+          <w:rFonts w:ascii="Carlito" w:hAnsi="Carlito" w:cs="Carlito"/>
+        </w:rPr>
+      </w:r>
+      <w:r>
+        <w:rPr>
+          <w:rFonts w:ascii="Carlito" w:hAnsi="Carlito" w:cs="Carlito"/>
+        </w:rPr>
+      </w:r>
+    </w:p>
+    <w:p>
+      <w:pPr>
+        <w:pStyle w:val="909"/>
+        <w:numPr>
+          <w:ilvl w:val="0"/>
+          <w:numId w:val="10"/>
+        </w:numPr>
+        <w:pBdr/>
+        <w:spacing/>
+        <w:ind/>
+        <w:rPr>
+          <w:rFonts w:ascii="Carlito" w:hAnsi="Carlito" w:cs="Carlito"/>
+        </w:rPr>
+      </w:pPr>
+      <w:r>
+        <w:t xml:space="preserve">Troubleshooting of software issues and technical support for customer implementations</w:t>
+      </w:r>
+      <w:r>
+        <w:rPr>
+          <w:rFonts w:ascii="Carlito" w:hAnsi="Carlito" w:cs="Carlito"/>
+        </w:rPr>
+      </w:r>
+      <w:r>
+        <w:rPr>
+          <w:rFonts w:ascii="Carlito" w:hAnsi="Carlito" w:cs="Carlito"/>
+        </w:rPr>
+      </w:r>
+    </w:p>
+    <w:p>
+      <w:pPr>
+        <w:pStyle w:val="909"/>
+        <w:numPr>
+          <w:ilvl w:val="0"/>
+          <w:numId w:val="10"/>
+        </w:numPr>
+        <w:pBdr/>
+        <w:spacing/>
+        <w:ind/>
+        <w:rPr>
+          <w:rFonts w:ascii="Carlito" w:hAnsi="Carlito" w:cs="Carlito"/>
+        </w:rPr>
+      </w:pPr>
+      <w:r>
+        <w:t xml:space="preserve">Regular collaboration with product developers and test engineers at OEMs and suppliers to support successful project execution</w:t>
+      </w:r>
+      <w:r>
+        <w:rPr>
+          <w:rFonts w:ascii="Carlito" w:hAnsi="Carlito" w:cs="Carlito"/>
+        </w:rPr>
+      </w:r>
+      <w:r>
+        <w:rPr>
+          <w:rFonts w:ascii="Carlito" w:hAnsi="Carlito" w:cs="Carlito"/>
+        </w:rPr>
+      </w:r>
+    </w:p>
+    <w:p>
+      <w:pPr>
+        <w:pStyle w:val="909"/>
+        <w:numPr>
+          <w:ilvl w:val="0"/>
+          <w:numId w:val="10"/>
+        </w:numPr>
+        <w:pBdr/>
+        <w:spacing/>
+        <w:ind/>
+        <w:rPr>
+          <w:rFonts w:ascii="Carlito" w:hAnsi="Carlito" w:cs="Carlito"/>
+        </w:rPr>
+      </w:pPr>
+      <w:r>
+        <w:t xml:space="preserve">Customer relationship management through regular technical meetings and long-term engagement</w:t>
+      </w:r>
+      <w:r>
+        <w:rPr>
+          <w:rFonts w:ascii="Carlito" w:hAnsi="Carlito" w:cs="Carlito"/>
+        </w:rPr>
+      </w:r>
+      <w:r>
+        <w:rPr>
+          <w:rFonts w:ascii="Carlito" w:hAnsi="Carlito" w:cs="Carlito"/>
+        </w:rPr>
+      </w:r>
+    </w:p>
+    <w:p>
+      <w:pPr>
+        <w:pStyle w:val="909"/>
+        <w:numPr>
+          <w:ilvl w:val="0"/>
+          <w:numId w:val="10"/>
+        </w:numPr>
+        <w:pBdr/>
+        <w:spacing/>
+        <w:ind/>
+        <w:rPr>
+          <w:rFonts w:ascii="Carlito" w:hAnsi="Carlito" w:cs="Carlito"/>
+        </w:rPr>
+      </w:pPr>
+      <w:r>
+        <w:t xml:space="preserve">Delivery of customer training, courseware development, and workshop instruction for embedded software systems</w:t>
+      </w:r>
+      <w:r>
+        <w:rPr>
+          <w:rFonts w:ascii="Carlito" w:hAnsi="Carlito" w:cs="Carlito"/>
+        </w:rPr>
+      </w:r>
+      <w:r>
+        <w:rPr>
+          <w:rFonts w:ascii="Carlito" w:hAnsi="Carlito" w:cs="Carlito"/>
+        </w:rPr>
+      </w:r>
+    </w:p>
+    <w:p>
+      <w:pPr>
+        <w:pStyle w:val="909"/>
+        <w:numPr>
+          <w:ilvl w:val="0"/>
+          <w:numId w:val="10"/>
+        </w:numPr>
+        <w:pBdr/>
+        <w:spacing/>
+        <w:ind/>
+        <w:rPr>
+          <w:rFonts w:ascii="Carlito" w:hAnsi="Carlito" w:cs="Carlito"/>
+        </w:rPr>
+      </w:pPr>
+      <w:r>
+        <w:t xml:space="preserve">Implementation and support of embedded software solutions in C/C++ for automotive electronic control modules</w:t>
+      </w:r>
+      <w:r>
+        <w:rPr>
+          <w:rFonts w:ascii="Carlito" w:hAnsi="Carlito" w:cs="Carlito"/>
+        </w:rPr>
+      </w:r>
+      <w:r>
+        <w:rPr>
+          <w:rFonts w:ascii="Carlito" w:hAnsi="Carlito" w:cs="Carlito"/>
+        </w:rPr>
+      </w:r>
+    </w:p>
+    <w:p>
+      <w:pPr>
+        <w:pStyle w:val="909"/>
         <w:pBdr/>
         <w:spacing/>
         <w:ind w:firstLine="0" w:left="0"/>
@@ -1465,9 +1292,7 @@
       </w:r>
       <w:r>
         <w:rPr>
-          <w:rFonts w:ascii="Carlito" w:hAnsi="Carlito" w:eastAsia="Carlito" w:cs="Carlito"/>
-          <w:sz w:val="22"/>
-          <w:highlight w:val="none"/>
+          <w:rFonts w:ascii="Carlito" w:hAnsi="Carlito" w:cs="Carlito"/>
         </w:rPr>
       </w:r>
       <w:r>
@@ -1505,7 +1330,10 @@
       </w:r>
       <w:r>
         <w:rPr>
-          <w:rFonts w:ascii="Carlito" w:hAnsi="Carlito" w:cs="Carlito"/>
+          <w:rFonts w:ascii="Carlito" w:hAnsi="Carlito" w:eastAsia="Carlito" w:cs="Carlito"/>
+          <w:sz w:val="22"/>
+          <w:szCs w:val="22"/>
+          <w:highlight w:val="none"/>
         </w:rPr>
       </w:r>
       <w:r>
@@ -1524,13 +1352,17 @@
         <w:spacing/>
         <w:ind/>
         <w:rPr>
-          <w:rFonts w:ascii="Carlito" w:hAnsi="Carlito" w:cs="Carlito"/>
+          <w:rFonts w:ascii="Carlito" w:hAnsi="Carlito" w:eastAsia="Carlito" w:cs="Carlito"/>
+          <w:sz w:val="22"/>
+          <w:szCs w:val="22"/>
+          <w:highlight w:val="none"/>
         </w:rPr>
       </w:pPr>
       <w:r>
         <w:rPr>
           <w:rFonts w:ascii="Carlito" w:hAnsi="Carlito" w:eastAsia="Carlito" w:cs="Carlito"/>
           <w:sz w:val="22"/>
+          <w:szCs w:val="22"/>
           <w:highlight w:val="none"/>
         </w:rPr>
       </w:r>
@@ -1538,12 +1370,54 @@
         <w:rPr>
           <w:rFonts w:ascii="Carlito" w:hAnsi="Carlito" w:eastAsia="Carlito" w:cs="Carlito"/>
           <w:sz w:val="22"/>
+          <w:szCs w:val="22"/>
           <w:highlight w:val="none"/>
         </w:rPr>
       </w:r>
       <w:r>
         <w:rPr>
-          <w:rFonts w:ascii="Carlito" w:hAnsi="Carlito" w:cs="Carlito"/>
+          <w:rFonts w:ascii="Carlito" w:hAnsi="Carlito" w:eastAsia="Carlito" w:cs="Carlito"/>
+          <w:sz w:val="22"/>
+          <w:szCs w:val="22"/>
+          <w:highlight w:val="none"/>
+        </w:rPr>
+      </w:r>
+    </w:p>
+    <w:p>
+      <w:pPr>
+        <w:pStyle w:val="909"/>
+        <w:pBdr/>
+        <w:spacing/>
+        <w:ind/>
+        <w:rPr>
+          <w:rFonts w:ascii="Carlito" w:hAnsi="Carlito" w:eastAsia="Carlito" w:cs="Carlito"/>
+          <w:sz w:val="22"/>
+          <w:szCs w:val="22"/>
+          <w:highlight w:val="none"/>
+        </w:rPr>
+      </w:pPr>
+      <w:r>
+        <w:rPr>
+          <w:rFonts w:ascii="Carlito" w:hAnsi="Carlito" w:eastAsia="Carlito" w:cs="Carlito"/>
+          <w:sz w:val="22"/>
+          <w:szCs w:val="22"/>
+          <w:highlight w:val="none"/>
+        </w:rPr>
+      </w:r>
+      <w:r>
+        <w:rPr>
+          <w:rFonts w:ascii="Carlito" w:hAnsi="Carlito" w:eastAsia="Carlito" w:cs="Carlito"/>
+          <w:sz w:val="22"/>
+          <w:szCs w:val="22"/>
+          <w:highlight w:val="none"/>
+        </w:rPr>
+      </w:r>
+      <w:r>
+        <w:rPr>
+          <w:rFonts w:ascii="Carlito" w:hAnsi="Carlito" w:eastAsia="Carlito" w:cs="Carlito"/>
+          <w:sz w:val="22"/>
+          <w:szCs w:val="22"/>
+          <w:highlight w:val="none"/>
         </w:rPr>
       </w:r>
     </w:p>
@@ -1571,10 +1445,10 @@
               <wp:anchor xmlns:wp="http://schemas.openxmlformats.org/drawingml/2006/wordprocessingDrawing" xmlns:wp14="http://schemas.microsoft.com/office/word/2010/wordprocessingDrawing" distT="0" distB="0" distL="115200" distR="115200" simplePos="0" relativeHeight="6144" behindDoc="1" locked="0" layoutInCell="1" allowOverlap="1">
                 <wp:simplePos x="0" y="0"/>
                 <wp:positionH relativeFrom="column">
-                  <wp:posOffset>-333045</wp:posOffset>
+                  <wp:posOffset>-190170</wp:posOffset>
                 </wp:positionH>
                 <wp:positionV relativeFrom="paragraph">
-                  <wp:posOffset>52334</wp:posOffset>
+                  <wp:posOffset>138059</wp:posOffset>
                 </wp:positionV>
                 <wp:extent cx="2661708" cy="789737"/>
                 <wp:effectExtent l="0" t="0" r="0" b="0"/>
@@ -1594,7 +1468,7 @@
                         <pic:nvPr/>
                       </pic:nvPicPr>
                       <pic:blipFill rotWithShape="1">
-                        <a:blip r:embed="rId11"/>
+                        <a:blip r:embed="rId12"/>
                         <a:stretch/>
                       </pic:blipFill>
                       <pic:spPr bwMode="auto">
@@ -1633,8 +1507,8 @@
                 <v:path o:extrusionok="f" gradientshapeok="t" o:connecttype="rect"/>
                 <o:lock v:ext="edit" aspectratio="t"/>
               </v:shapetype>
-              <v:shape id="_x0000_i1" o:spid="_x0000_s1" type="#_x0000_t75" style="position:absolute;z-index:-6144;o:allowoverlap:true;o:allowincell:true;mso-position-horizontal-relative:text;margin-left:-26.22pt;mso-position-horizontal:absolute;mso-position-vertical-relative:text;margin-top:4.12pt;mso-position-vertical:absolute;width:209.58pt;height:62.18pt;mso-wrap-distance-left:9.07pt;mso-wrap-distance-top:0.00pt;mso-wrap-distance-right:9.07pt;mso-wrap-distance-bottom:0.00pt;z-index:1;" stroked="false">
-                <v:imagedata r:id="rId11" o:title=""/>
+              <v:shape id="_x0000_i1" o:spid="_x0000_s1" type="#_x0000_t75" style="position:absolute;z-index:-6144;o:allowoverlap:true;o:allowincell:true;mso-position-horizontal-relative:text;margin-left:-14.97pt;mso-position-horizontal:absolute;mso-position-vertical-relative:text;margin-top:10.87pt;mso-position-vertical:absolute;width:209.58pt;height:62.18pt;mso-wrap-distance-left:9.07pt;mso-wrap-distance-top:0.00pt;mso-wrap-distance-right:9.07pt;mso-wrap-distance-bottom:0.00pt;z-index:1;" stroked="false">
+                <v:imagedata r:id="rId12" o:title=""/>
                 <o:lock v:ext="edit" rotation="t"/>
               </v:shape>
             </w:pict>
@@ -1651,7 +1525,7 @@
       </w:r>
       <w:r>
         <w:rPr>
-          <w:rFonts w:ascii="Carlito" w:hAnsi="Carlito" w:eastAsia="Carlito" w:cs="Carlito"/>
+          <w:rFonts w:ascii="Carlito" w:hAnsi="Carlito" w:cs="Carlito"/>
         </w:rPr>
       </w:r>
       <w:r>
@@ -1670,11 +1544,6 @@
           <w:rFonts w:ascii="Carlito" w:hAnsi="Carlito" w:cs="Carlito"/>
         </w:rPr>
       </w:pPr>
-      <w:r>
-        <w:rPr>
-          <w:rFonts w:ascii="Carlito" w:hAnsi="Carlito" w:eastAsia="Carlito" w:cs="Carlito"/>
-        </w:rPr>
-      </w:r>
       <w:r>
         <w:rPr>
           <w:rFonts w:ascii="Carlito" w:hAnsi="Carlito" w:eastAsia="Carlito" w:cs="Carlito"/>
@@ -1685,6 +1554,11 @@
           <w:rFonts w:ascii="Carlito" w:hAnsi="Carlito" w:cs="Carlito"/>
         </w:rPr>
       </w:r>
+      <w:r>
+        <w:rPr>
+          <w:rFonts w:ascii="Carlito" w:hAnsi="Carlito" w:cs="Carlito"/>
+        </w:rPr>
+      </w:r>
     </w:p>
     <w:p>
       <w:pPr>
@@ -1694,6 +1568,40 @@
         <w:ind/>
         <w:rPr>
           <w:rFonts w:ascii="Carlito" w:hAnsi="Carlito" w:cs="Carlito"/>
+        </w:rPr>
+      </w:pPr>
+      <w:r>
+        <w:rPr>
+          <w:rFonts w:ascii="Carlito" w:hAnsi="Carlito" w:eastAsia="Carlito" w:cs="Carlito"/>
+          <w:b/>
+          <w:sz w:val="22"/>
+          <w:highlight w:val="none"/>
+        </w:rPr>
+      </w:r>
+      <w:r>
+        <w:rPr>
+          <w:rFonts w:ascii="Carlito" w:hAnsi="Carlito" w:cs="Carlito"/>
+        </w:rPr>
+      </w:r>
+      <w:r>
+        <w:rPr>
+          <w:rFonts w:ascii="Carlito" w:hAnsi="Carlito" w:cs="Carlito"/>
+        </w:rPr>
+      </w:r>
+    </w:p>
+    <w:p>
+      <w:pPr>
+        <w:pStyle w:val="909"/>
+        <w:pBdr/>
+        <w:spacing/>
+        <w:ind/>
+        <w:rPr>
+          <w:rFonts w:ascii="Carlito" w:hAnsi="Carlito" w:eastAsia="Carlito" w:cs="Carlito"/>
+          <w:b/>
+          <w:bCs/>
+          <w:sz w:val="22"/>
+          <w:szCs w:val="22"/>
+          <w:highlight w:val="none"/>
         </w:rPr>
       </w:pPr>
       <w:r>
@@ -1708,13 +1616,20 @@
         <w:rPr>
           <w:rFonts w:ascii="Carlito" w:hAnsi="Carlito" w:eastAsia="Carlito" w:cs="Carlito"/>
           <w:b/>
+          <w:bCs/>
           <w:sz w:val="22"/>
+          <w:szCs w:val="22"/>
           <w:highlight w:val="none"/>
         </w:rPr>
       </w:r>
       <w:r>
         <w:rPr>
-          <w:rFonts w:ascii="Carlito" w:hAnsi="Carlito" w:cs="Carlito"/>
+          <w:rFonts w:ascii="Carlito" w:hAnsi="Carlito" w:eastAsia="Carlito" w:cs="Carlito"/>
+          <w:b/>
+          <w:bCs/>
+          <w:sz w:val="22"/>
+          <w:szCs w:val="22"/>
+          <w:highlight w:val="none"/>
         </w:rPr>
       </w:r>
     </w:p>
@@ -1786,6 +1701,11 @@
       <w:r>
         <w:rPr>
           <w:rFonts w:ascii="Carlito" w:hAnsi="Carlito" w:eastAsia="Carlito" w:cs="Carlito"/>
+          <w:b/>
+          <w:bCs/>
+          <w:sz w:val="22"/>
+          <w:szCs w:val="22"/>
+          <w:highlight w:val="none"/>
         </w:rPr>
       </w:r>
       <w:r>
@@ -1819,7 +1739,7 @@
       </w:r>
       <w:r>
         <w:rPr>
-          <w:rFonts w:ascii="Carlito" w:hAnsi="Carlito" w:eastAsia="Carlito" w:cs="Carlito"/>
+          <w:rFonts w:ascii="Carlito" w:hAnsi="Carlito" w:cs="Carlito"/>
         </w:rPr>
       </w:r>
       <w:r>
@@ -1851,7 +1771,7 @@
       </w:r>
       <w:r>
         <w:rPr>
-          <w:rFonts w:ascii="Carlito" w:hAnsi="Carlito" w:eastAsia="Carlito" w:cs="Carlito"/>
+          <w:rFonts w:ascii="Carlito" w:hAnsi="Carlito" w:cs="Carlito"/>
         </w:rPr>
       </w:r>
       <w:r>
@@ -1880,7 +1800,7 @@
       </w:r>
       <w:r>
         <w:rPr>
-          <w:rFonts w:ascii="Carlito" w:hAnsi="Carlito" w:eastAsia="Carlito" w:cs="Carlito"/>
+          <w:rFonts w:ascii="Carlito" w:hAnsi="Carlito" w:cs="Carlito"/>
         </w:rPr>
       </w:r>
       <w:r>
@@ -58233,7 +58153,7 @@
 </file>
 
 <file path=customXml/itemProps1.xml><?xml version="1.0" encoding="utf-8"?>
-<ds:datastoreItem xmlns:ds="http://schemas.openxmlformats.org/officeDocument/2006/customXml" ds:itemID="ef278816-ec6f-a645-907d-7f25aecb1d4a">
+<ds:datastoreItem xmlns:ds="http://schemas.openxmlformats.org/officeDocument/2006/customXml" ds:itemID="EF278816-EC6F-A645-907D-7F25AECB1D4A">
   <ds:schemaRefs>
     <ds:schemaRef ds:uri="http://schemas.openxmlformats.org/officeDocument/2006/bibliography"/>
   </ds:schemaRefs>

</xml_diff>